<commit_message>
Add production screenshots and regenerate manuals with real images
</commit_message>
<xml_diff>
--- a/docs/Cosmetic_User_Manual.docx
+++ b/docs/Cosmetic_User_Manual.docx
@@ -502,26 +502,48 @@
     </w:p>
     <w:p>
       <w:pPr>
-        <w:pBdr>
-          <w:top w:val="dashed" w:color="E8DDD9" w:sz="2"/>
-          <w:bottom w:val="dashed" w:color="E8DDD9" w:sz="2"/>
-          <w:left w:val="dashed" w:color="E8DDD9" w:sz="2"/>
-          <w:right w:val="dashed" w:color="E8DDD9" w:sz="2"/>
-        </w:pBdr>
-        <w:shd w:fill="FAFAFA" w:val="clear"/>
-        <w:spacing w:after="160" w:before="160"/>
+        <w:spacing w:after="80" w:before="160"/>
         <w:jc w:val="center"/>
       </w:pPr>
       <w:r>
-        <w:rPr>
-          <w:rFonts w:ascii="Courier New" w:cs="Courier New" w:eastAsia="Courier New" w:hAnsi="Courier New"/>
-          <w:i/>
-          <w:iCs/>
-          <w:color w:val="9A8F8A"/>
-          <w:sz w:val="20"/>
-          <w:szCs w:val="20"/>
-        </w:rPr>
-        <w:t xml:space="preserve">[ Screenshot: TC-01-01.png — Full navigation bar ]</w:t>
+        <w:drawing>
+          <wp:inline distT="0" distB="0" distL="0" distR="0">
+            <wp:extent cx="4572000" cy="2857500"/>
+            <wp:effectExtent t="0" r="0" b="0" l="0"/>
+            <wp:docPr id="1" name="" descr="" title=""/>
+            <wp:cNvGraphicFramePr>
+              <a:graphicFrameLocks xmlns:a="http://schemas.openxmlformats.org/drawingml/2006/main" noChangeAspect="1"/>
+            </wp:cNvGraphicFramePr>
+            <a:graphic xmlns:a="http://schemas.openxmlformats.org/drawingml/2006/main">
+              <a:graphicData uri="http://schemas.openxmlformats.org/drawingml/2006/picture">
+                <pic:pic xmlns:pic="http://schemas.openxmlformats.org/drawingml/2006/picture">
+                  <pic:nvPicPr>
+                    <pic:cNvPr id="0" name="" descr=""/>
+                    <pic:cNvPicPr>
+                      <a:picLocks noChangeAspect="1" noChangeArrowheads="1"/>
+                    </pic:cNvPicPr>
+                  </pic:nvPicPr>
+                  <pic:blipFill>
+                    <a:blip r:embed="rId9" cstate="none"/>
+                    <a:srcRect/>
+                    <a:stretch>
+                      <a:fillRect/>
+                    </a:stretch>
+                  </pic:blipFill>
+                  <pic:spPr bwMode="auto">
+                    <a:xfrm>
+                      <a:off x="0" y="0"/>
+                      <a:ext cx="4572000" cy="2857500"/>
+                    </a:xfrm>
+                    <a:prstGeom prst="rect">
+                      <a:avLst/>
+                    </a:prstGeom>
+                  </pic:spPr>
+                </pic:pic>
+              </a:graphicData>
+            </a:graphic>
+          </wp:inline>
+        </w:drawing>
       </w:r>
     </w:p>
     <w:p>
@@ -856,26 +878,48 @@
     </w:tbl>
     <w:p>
       <w:pPr>
-        <w:pBdr>
-          <w:top w:val="dashed" w:color="E8DDD9" w:sz="2"/>
-          <w:bottom w:val="dashed" w:color="E8DDD9" w:sz="2"/>
-          <w:left w:val="dashed" w:color="E8DDD9" w:sz="2"/>
-          <w:right w:val="dashed" w:color="E8DDD9" w:sz="2"/>
-        </w:pBdr>
-        <w:shd w:fill="FAFAFA" w:val="clear"/>
-        <w:spacing w:after="160" w:before="160"/>
+        <w:spacing w:after="80" w:before="160"/>
         <w:jc w:val="center"/>
       </w:pPr>
       <w:r>
-        <w:rPr>
-          <w:rFonts w:ascii="Courier New" w:cs="Courier New" w:eastAsia="Courier New" w:hAnsi="Courier New"/>
-          <w:i/>
-          <w:iCs/>
-          <w:color w:val="9A8F8A"/>
-          <w:sz w:val="20"/>
-          <w:szCs w:val="20"/>
-        </w:rPr>
-        <w:t xml:space="preserve">[ Screenshot: TC-01-02.png — Sticky navbar after scroll ]</w:t>
+        <w:drawing>
+          <wp:inline distT="0" distB="0" distL="0" distR="0">
+            <wp:extent cx="4572000" cy="2857500"/>
+            <wp:effectExtent t="0" r="0" b="0" l="0"/>
+            <wp:docPr id="1" name="" descr="" title=""/>
+            <wp:cNvGraphicFramePr>
+              <a:graphicFrameLocks xmlns:a="http://schemas.openxmlformats.org/drawingml/2006/main" noChangeAspect="1"/>
+            </wp:cNvGraphicFramePr>
+            <a:graphic xmlns:a="http://schemas.openxmlformats.org/drawingml/2006/main">
+              <a:graphicData uri="http://schemas.openxmlformats.org/drawingml/2006/picture">
+                <pic:pic xmlns:pic="http://schemas.openxmlformats.org/drawingml/2006/picture">
+                  <pic:nvPicPr>
+                    <pic:cNvPr id="0" name="" descr=""/>
+                    <pic:cNvPicPr>
+                      <a:picLocks noChangeAspect="1" noChangeArrowheads="1"/>
+                    </pic:cNvPicPr>
+                  </pic:nvPicPr>
+                  <pic:blipFill>
+                    <a:blip r:embed="rId10" cstate="none"/>
+                    <a:srcRect/>
+                    <a:stretch>
+                      <a:fillRect/>
+                    </a:stretch>
+                  </pic:blipFill>
+                  <pic:spPr bwMode="auto">
+                    <a:xfrm>
+                      <a:off x="0" y="0"/>
+                      <a:ext cx="4572000" cy="2857500"/>
+                    </a:xfrm>
+                    <a:prstGeom prst="rect">
+                      <a:avLst/>
+                    </a:prstGeom>
+                  </pic:spPr>
+                </pic:pic>
+              </a:graphicData>
+            </a:graphic>
+          </wp:inline>
+        </w:drawing>
       </w:r>
     </w:p>
     <w:p>
@@ -1316,26 +1360,48 @@
     </w:p>
     <w:p>
       <w:pPr>
-        <w:pBdr>
-          <w:top w:val="dashed" w:color="E8DDD9" w:sz="2"/>
-          <w:bottom w:val="dashed" w:color="E8DDD9" w:sz="2"/>
-          <w:left w:val="dashed" w:color="E8DDD9" w:sz="2"/>
-          <w:right w:val="dashed" w:color="E8DDD9" w:sz="2"/>
-        </w:pBdr>
-        <w:shd w:fill="FAFAFA" w:val="clear"/>
-        <w:spacing w:after="160" w:before="160"/>
+        <w:spacing w:after="80" w:before="160"/>
         <w:jc w:val="center"/>
       </w:pPr>
       <w:r>
-        <w:rPr>
-          <w:rFonts w:ascii="Courier New" w:cs="Courier New" w:eastAsia="Courier New" w:hAnsi="Courier New"/>
-          <w:i/>
-          <w:iCs/>
-          <w:color w:val="9A8F8A"/>
-          <w:sz w:val="20"/>
-          <w:szCs w:val="20"/>
-        </w:rPr>
-        <w:t xml:space="preserve">[ Screenshot: TC-03-01.png — Banner with image and text overlay ]</w:t>
+        <w:drawing>
+          <wp:inline distT="0" distB="0" distL="0" distR="0">
+            <wp:extent cx="4572000" cy="2857500"/>
+            <wp:effectExtent t="0" r="0" b="0" l="0"/>
+            <wp:docPr id="1" name="" descr="" title=""/>
+            <wp:cNvGraphicFramePr>
+              <a:graphicFrameLocks xmlns:a="http://schemas.openxmlformats.org/drawingml/2006/main" noChangeAspect="1"/>
+            </wp:cNvGraphicFramePr>
+            <a:graphic xmlns:a="http://schemas.openxmlformats.org/drawingml/2006/main">
+              <a:graphicData uri="http://schemas.openxmlformats.org/drawingml/2006/picture">
+                <pic:pic xmlns:pic="http://schemas.openxmlformats.org/drawingml/2006/picture">
+                  <pic:nvPicPr>
+                    <pic:cNvPr id="0" name="" descr=""/>
+                    <pic:cNvPicPr>
+                      <a:picLocks noChangeAspect="1" noChangeArrowheads="1"/>
+                    </pic:cNvPicPr>
+                  </pic:nvPicPr>
+                  <pic:blipFill>
+                    <a:blip r:embed="rId9" cstate="none"/>
+                    <a:srcRect/>
+                    <a:stretch>
+                      <a:fillRect/>
+                    </a:stretch>
+                  </pic:blipFill>
+                  <pic:spPr bwMode="auto">
+                    <a:xfrm>
+                      <a:off x="0" y="0"/>
+                      <a:ext cx="4572000" cy="2857500"/>
+                    </a:xfrm>
+                    <a:prstGeom prst="rect">
+                      <a:avLst/>
+                    </a:prstGeom>
+                  </pic:spPr>
+                </pic:pic>
+              </a:graphicData>
+            </a:graphic>
+          </wp:inline>
+        </w:drawing>
       </w:r>
     </w:p>
     <w:p>
@@ -1799,26 +1865,48 @@
     </w:tbl>
     <w:p>
       <w:pPr>
-        <w:pBdr>
-          <w:top w:val="dashed" w:color="E8DDD9" w:sz="2"/>
-          <w:bottom w:val="dashed" w:color="E8DDD9" w:sz="2"/>
-          <w:left w:val="dashed" w:color="E8DDD9" w:sz="2"/>
-          <w:right w:val="dashed" w:color="E8DDD9" w:sz="2"/>
-        </w:pBdr>
-        <w:shd w:fill="FAFAFA" w:val="clear"/>
-        <w:spacing w:after="160" w:before="160"/>
+        <w:spacing w:after="80" w:before="160"/>
         <w:jc w:val="center"/>
       </w:pPr>
       <w:r>
-        <w:rPr>
-          <w:rFonts w:ascii="Courier New" w:cs="Courier New" w:eastAsia="Courier New" w:hAnsi="Courier New"/>
-          <w:i/>
-          <w:iCs/>
-          <w:color w:val="9A8F8A"/>
-          <w:sz w:val="20"/>
-          <w:szCs w:val="20"/>
-        </w:rPr>
-        <w:t xml:space="preserve">[ Screenshot: TC-03-02.png — Slider advanced to second banner ]</w:t>
+        <w:drawing>
+          <wp:inline distT="0" distB="0" distL="0" distR="0">
+            <wp:extent cx="4572000" cy="2857500"/>
+            <wp:effectExtent t="0" r="0" b="0" l="0"/>
+            <wp:docPr id="1" name="" descr="" title=""/>
+            <wp:cNvGraphicFramePr>
+              <a:graphicFrameLocks xmlns:a="http://schemas.openxmlformats.org/drawingml/2006/main" noChangeAspect="1"/>
+            </wp:cNvGraphicFramePr>
+            <a:graphic xmlns:a="http://schemas.openxmlformats.org/drawingml/2006/main">
+              <a:graphicData uri="http://schemas.openxmlformats.org/drawingml/2006/picture">
+                <pic:pic xmlns:pic="http://schemas.openxmlformats.org/drawingml/2006/picture">
+                  <pic:nvPicPr>
+                    <pic:cNvPr id="0" name="" descr=""/>
+                    <pic:cNvPicPr>
+                      <a:picLocks noChangeAspect="1" noChangeArrowheads="1"/>
+                    </pic:cNvPicPr>
+                  </pic:nvPicPr>
+                  <pic:blipFill>
+                    <a:blip r:embed="rId9" cstate="none"/>
+                    <a:srcRect/>
+                    <a:stretch>
+                      <a:fillRect/>
+                    </a:stretch>
+                  </pic:blipFill>
+                  <pic:spPr bwMode="auto">
+                    <a:xfrm>
+                      <a:off x="0" y="0"/>
+                      <a:ext cx="4572000" cy="2857500"/>
+                    </a:xfrm>
+                    <a:prstGeom prst="rect">
+                      <a:avLst/>
+                    </a:prstGeom>
+                  </pic:spPr>
+                </pic:pic>
+              </a:graphicData>
+            </a:graphic>
+          </wp:inline>
+        </w:drawing>
       </w:r>
     </w:p>
     <w:p>
@@ -1832,26 +1920,48 @@
     </w:p>
     <w:p>
       <w:pPr>
-        <w:pBdr>
-          <w:top w:val="dashed" w:color="E8DDD9" w:sz="2"/>
-          <w:bottom w:val="dashed" w:color="E8DDD9" w:sz="2"/>
-          <w:left w:val="dashed" w:color="E8DDD9" w:sz="2"/>
-          <w:right w:val="dashed" w:color="E8DDD9" w:sz="2"/>
-        </w:pBdr>
-        <w:shd w:fill="FAFAFA" w:val="clear"/>
-        <w:spacing w:after="160" w:before="160"/>
+        <w:spacing w:after="80" w:before="160"/>
         <w:jc w:val="center"/>
       </w:pPr>
       <w:r>
-        <w:rPr>
-          <w:rFonts w:ascii="Courier New" w:cs="Courier New" w:eastAsia="Courier New" w:hAnsi="Courier New"/>
-          <w:i/>
-          <w:iCs/>
-          <w:color w:val="9A8F8A"/>
-          <w:sz w:val="20"/>
-          <w:szCs w:val="20"/>
-        </w:rPr>
-        <w:t xml:space="preserve">[ Screenshot: TC-04-01.png — Category pills ]</w:t>
+        <w:drawing>
+          <wp:inline distT="0" distB="0" distL="0" distR="0">
+            <wp:extent cx="4572000" cy="2857500"/>
+            <wp:effectExtent t="0" r="0" b="0" l="0"/>
+            <wp:docPr id="1" name="" descr="" title=""/>
+            <wp:cNvGraphicFramePr>
+              <a:graphicFrameLocks xmlns:a="http://schemas.openxmlformats.org/drawingml/2006/main" noChangeAspect="1"/>
+            </wp:cNvGraphicFramePr>
+            <a:graphic xmlns:a="http://schemas.openxmlformats.org/drawingml/2006/main">
+              <a:graphicData uri="http://schemas.openxmlformats.org/drawingml/2006/picture">
+                <pic:pic xmlns:pic="http://schemas.openxmlformats.org/drawingml/2006/picture">
+                  <pic:nvPicPr>
+                    <pic:cNvPr id="0" name="" descr=""/>
+                    <pic:cNvPicPr>
+                      <a:picLocks noChangeAspect="1" noChangeArrowheads="1"/>
+                    </pic:cNvPicPr>
+                  </pic:nvPicPr>
+                  <pic:blipFill>
+                    <a:blip r:embed="rId11" cstate="none"/>
+                    <a:srcRect/>
+                    <a:stretch>
+                      <a:fillRect/>
+                    </a:stretch>
+                  </pic:blipFill>
+                  <pic:spPr bwMode="auto">
+                    <a:xfrm>
+                      <a:off x="0" y="0"/>
+                      <a:ext cx="4572000" cy="2857500"/>
+                    </a:xfrm>
+                    <a:prstGeom prst="rect">
+                      <a:avLst/>
+                    </a:prstGeom>
+                  </pic:spPr>
+                </pic:pic>
+              </a:graphicData>
+            </a:graphic>
+          </wp:inline>
+        </w:drawing>
       </w:r>
     </w:p>
     <w:p>
@@ -2232,26 +2342,48 @@
     </w:p>
     <w:p>
       <w:pPr>
-        <w:pBdr>
-          <w:top w:val="dashed" w:color="E8DDD9" w:sz="2"/>
-          <w:bottom w:val="dashed" w:color="E8DDD9" w:sz="2"/>
-          <w:left w:val="dashed" w:color="E8DDD9" w:sz="2"/>
-          <w:right w:val="dashed" w:color="E8DDD9" w:sz="2"/>
-        </w:pBdr>
-        <w:shd w:fill="FAFAFA" w:val="clear"/>
-        <w:spacing w:after="160" w:before="160"/>
+        <w:spacing w:after="80" w:before="160"/>
         <w:jc w:val="center"/>
       </w:pPr>
       <w:r>
-        <w:rPr>
-          <w:rFonts w:ascii="Courier New" w:cs="Courier New" w:eastAsia="Courier New" w:hAnsi="Courier New"/>
-          <w:i/>
-          <w:iCs/>
-          <w:color w:val="9A8F8A"/>
-          <w:sz w:val="20"/>
-          <w:szCs w:val="20"/>
-        </w:rPr>
-        <w:t xml:space="preserve">[ Screenshot: TC-05-01.png — Product grid overview ]</w:t>
+        <w:drawing>
+          <wp:inline distT="0" distB="0" distL="0" distR="0">
+            <wp:extent cx="4572000" cy="2857500"/>
+            <wp:effectExtent t="0" r="0" b="0" l="0"/>
+            <wp:docPr id="1" name="" descr="" title=""/>
+            <wp:cNvGraphicFramePr>
+              <a:graphicFrameLocks xmlns:a="http://schemas.openxmlformats.org/drawingml/2006/main" noChangeAspect="1"/>
+            </wp:cNvGraphicFramePr>
+            <a:graphic xmlns:a="http://schemas.openxmlformats.org/drawingml/2006/main">
+              <a:graphicData uri="http://schemas.openxmlformats.org/drawingml/2006/picture">
+                <pic:pic xmlns:pic="http://schemas.openxmlformats.org/drawingml/2006/picture">
+                  <pic:nvPicPr>
+                    <pic:cNvPr id="0" name="" descr=""/>
+                    <pic:cNvPicPr>
+                      <a:picLocks noChangeAspect="1" noChangeArrowheads="1"/>
+                    </pic:cNvPicPr>
+                  </pic:nvPicPr>
+                  <pic:blipFill>
+                    <a:blip r:embed="rId12" cstate="none"/>
+                    <a:srcRect/>
+                    <a:stretch>
+                      <a:fillRect/>
+                    </a:stretch>
+                  </pic:blipFill>
+                  <pic:spPr bwMode="auto">
+                    <a:xfrm>
+                      <a:off x="0" y="0"/>
+                      <a:ext cx="4572000" cy="2857500"/>
+                    </a:xfrm>
+                    <a:prstGeom prst="rect">
+                      <a:avLst/>
+                    </a:prstGeom>
+                  </pic:spPr>
+                </pic:pic>
+              </a:graphicData>
+            </a:graphic>
+          </wp:inline>
+        </w:drawing>
       </w:r>
     </w:p>
     <w:p>
@@ -2574,26 +2706,48 @@
     </w:p>
     <w:p>
       <w:pPr>
-        <w:pBdr>
-          <w:top w:val="dashed" w:color="E8DDD9" w:sz="2"/>
-          <w:bottom w:val="dashed" w:color="E8DDD9" w:sz="2"/>
-          <w:left w:val="dashed" w:color="E8DDD9" w:sz="2"/>
-          <w:right w:val="dashed" w:color="E8DDD9" w:sz="2"/>
-        </w:pBdr>
-        <w:shd w:fill="FAFAFA" w:val="clear"/>
-        <w:spacing w:after="160" w:before="160"/>
+        <w:spacing w:after="80" w:before="160"/>
         <w:jc w:val="center"/>
       </w:pPr>
       <w:r>
-        <w:rPr>
-          <w:rFonts w:ascii="Courier New" w:cs="Courier New" w:eastAsia="Courier New" w:hAnsi="Courier New"/>
-          <w:i/>
-          <w:iCs/>
-          <w:color w:val="9A8F8A"/>
-          <w:sz w:val="20"/>
-          <w:szCs w:val="20"/>
-        </w:rPr>
-        <w:t xml:space="preserve">[ Screenshot: TC-06-01.png — Product modal open ]</w:t>
+        <w:drawing>
+          <wp:inline distT="0" distB="0" distL="0" distR="0">
+            <wp:extent cx="4572000" cy="2857500"/>
+            <wp:effectExtent t="0" r="0" b="0" l="0"/>
+            <wp:docPr id="1" name="" descr="" title=""/>
+            <wp:cNvGraphicFramePr>
+              <a:graphicFrameLocks xmlns:a="http://schemas.openxmlformats.org/drawingml/2006/main" noChangeAspect="1"/>
+            </wp:cNvGraphicFramePr>
+            <a:graphic xmlns:a="http://schemas.openxmlformats.org/drawingml/2006/main">
+              <a:graphicData uri="http://schemas.openxmlformats.org/drawingml/2006/picture">
+                <pic:pic xmlns:pic="http://schemas.openxmlformats.org/drawingml/2006/picture">
+                  <pic:nvPicPr>
+                    <pic:cNvPr id="0" name="" descr=""/>
+                    <pic:cNvPicPr>
+                      <a:picLocks noChangeAspect="1" noChangeArrowheads="1"/>
+                    </pic:cNvPicPr>
+                  </pic:nvPicPr>
+                  <pic:blipFill>
+                    <a:blip r:embed="rId13" cstate="none"/>
+                    <a:srcRect/>
+                    <a:stretch>
+                      <a:fillRect/>
+                    </a:stretch>
+                  </pic:blipFill>
+                  <pic:spPr bwMode="auto">
+                    <a:xfrm>
+                      <a:off x="0" y="0"/>
+                      <a:ext cx="4572000" cy="2857500"/>
+                    </a:xfrm>
+                    <a:prstGeom prst="rect">
+                      <a:avLst/>
+                    </a:prstGeom>
+                  </pic:spPr>
+                </pic:pic>
+              </a:graphicData>
+            </a:graphic>
+          </wp:inline>
+        </w:drawing>
       </w:r>
     </w:p>
     <w:p>
@@ -3117,26 +3271,48 @@
     </w:p>
     <w:p>
       <w:pPr>
-        <w:pBdr>
-          <w:top w:val="dashed" w:color="E8DDD9" w:sz="2"/>
-          <w:bottom w:val="dashed" w:color="E8DDD9" w:sz="2"/>
-          <w:left w:val="dashed" w:color="E8DDD9" w:sz="2"/>
-          <w:right w:val="dashed" w:color="E8DDD9" w:sz="2"/>
-        </w:pBdr>
-        <w:shd w:fill="FAFAFA" w:val="clear"/>
-        <w:spacing w:after="160" w:before="160"/>
+        <w:spacing w:after="80" w:before="160"/>
         <w:jc w:val="center"/>
       </w:pPr>
       <w:r>
-        <w:rPr>
-          <w:rFonts w:ascii="Courier New" w:cs="Courier New" w:eastAsia="Courier New" w:hAnsi="Courier New"/>
-          <w:i/>
-          <w:iCs/>
-          <w:color w:val="9A8F8A"/>
-          <w:sz w:val="20"/>
-          <w:szCs w:val="20"/>
-        </w:rPr>
-        <w:t xml:space="preserve">[ Screenshot: TC-07-01.png — Contact form ]</w:t>
+        <w:drawing>
+          <wp:inline distT="0" distB="0" distL="0" distR="0">
+            <wp:extent cx="4572000" cy="2857500"/>
+            <wp:effectExtent t="0" r="0" b="0" l="0"/>
+            <wp:docPr id="1" name="" descr="" title=""/>
+            <wp:cNvGraphicFramePr>
+              <a:graphicFrameLocks xmlns:a="http://schemas.openxmlformats.org/drawingml/2006/main" noChangeAspect="1"/>
+            </wp:cNvGraphicFramePr>
+            <a:graphic xmlns:a="http://schemas.openxmlformats.org/drawingml/2006/main">
+              <a:graphicData uri="http://schemas.openxmlformats.org/drawingml/2006/picture">
+                <pic:pic xmlns:pic="http://schemas.openxmlformats.org/drawingml/2006/picture">
+                  <pic:nvPicPr>
+                    <pic:cNvPr id="0" name="" descr=""/>
+                    <pic:cNvPicPr>
+                      <a:picLocks noChangeAspect="1" noChangeArrowheads="1"/>
+                    </pic:cNvPicPr>
+                  </pic:nvPicPr>
+                  <pic:blipFill>
+                    <a:blip r:embed="rId14" cstate="none"/>
+                    <a:srcRect/>
+                    <a:stretch>
+                      <a:fillRect/>
+                    </a:stretch>
+                  </pic:blipFill>
+                  <pic:spPr bwMode="auto">
+                    <a:xfrm>
+                      <a:off x="0" y="0"/>
+                      <a:ext cx="4572000" cy="2857500"/>
+                    </a:xfrm>
+                    <a:prstGeom prst="rect">
+                      <a:avLst/>
+                    </a:prstGeom>
+                  </pic:spPr>
+                </pic:pic>
+              </a:graphicData>
+            </a:graphic>
+          </wp:inline>
+        </w:drawing>
       </w:r>
     </w:p>
     <w:p>
@@ -3718,26 +3894,48 @@
     </w:p>
     <w:p>
       <w:pPr>
-        <w:pBdr>
-          <w:top w:val="dashed" w:color="E8DDD9" w:sz="2"/>
-          <w:bottom w:val="dashed" w:color="E8DDD9" w:sz="2"/>
-          <w:left w:val="dashed" w:color="E8DDD9" w:sz="2"/>
-          <w:right w:val="dashed" w:color="E8DDD9" w:sz="2"/>
-        </w:pBdr>
-        <w:shd w:fill="FAFAFA" w:val="clear"/>
-        <w:spacing w:after="160" w:before="160"/>
+        <w:spacing w:after="80" w:before="160"/>
         <w:jc w:val="center"/>
       </w:pPr>
       <w:r>
-        <w:rPr>
-          <w:rFonts w:ascii="Courier New" w:cs="Courier New" w:eastAsia="Courier New" w:hAnsi="Courier New"/>
-          <w:i/>
-          <w:iCs/>
-          <w:color w:val="9A8F8A"/>
-          <w:sz w:val="20"/>
-          <w:szCs w:val="20"/>
-        </w:rPr>
-        <w:t xml:space="preserve">[ Screenshot: TC-08-01.png — Footer section ]</w:t>
+        <w:drawing>
+          <wp:inline distT="0" distB="0" distL="0" distR="0">
+            <wp:extent cx="4572000" cy="2857500"/>
+            <wp:effectExtent t="0" r="0" b="0" l="0"/>
+            <wp:docPr id="1" name="" descr="" title=""/>
+            <wp:cNvGraphicFramePr>
+              <a:graphicFrameLocks xmlns:a="http://schemas.openxmlformats.org/drawingml/2006/main" noChangeAspect="1"/>
+            </wp:cNvGraphicFramePr>
+            <a:graphic xmlns:a="http://schemas.openxmlformats.org/drawingml/2006/main">
+              <a:graphicData uri="http://schemas.openxmlformats.org/drawingml/2006/picture">
+                <pic:pic xmlns:pic="http://schemas.openxmlformats.org/drawingml/2006/picture">
+                  <pic:nvPicPr>
+                    <pic:cNvPr id="0" name="" descr=""/>
+                    <pic:cNvPicPr>
+                      <a:picLocks noChangeAspect="1" noChangeArrowheads="1"/>
+                    </pic:cNvPicPr>
+                  </pic:nvPicPr>
+                  <pic:blipFill>
+                    <a:blip r:embed="rId15" cstate="none"/>
+                    <a:srcRect/>
+                    <a:stretch>
+                      <a:fillRect/>
+                    </a:stretch>
+                  </pic:blipFill>
+                  <pic:spPr bwMode="auto">
+                    <a:xfrm>
+                      <a:off x="0" y="0"/>
+                      <a:ext cx="4572000" cy="2857500"/>
+                    </a:xfrm>
+                    <a:prstGeom prst="rect">
+                      <a:avLst/>
+                    </a:prstGeom>
+                  </pic:spPr>
+                </pic:pic>
+              </a:graphicData>
+            </a:graphic>
+          </wp:inline>
+        </w:drawing>
       </w:r>
     </w:p>
     <w:p>
@@ -3868,26 +4066,48 @@
     </w:p>
     <w:p>
       <w:pPr>
-        <w:pBdr>
-          <w:top w:val="dashed" w:color="E8DDD9" w:sz="2"/>
-          <w:bottom w:val="dashed" w:color="E8DDD9" w:sz="2"/>
-          <w:left w:val="dashed" w:color="E8DDD9" w:sz="2"/>
-          <w:right w:val="dashed" w:color="E8DDD9" w:sz="2"/>
-        </w:pBdr>
-        <w:shd w:fill="FAFAFA" w:val="clear"/>
-        <w:spacing w:after="160" w:before="160"/>
+        <w:spacing w:after="80" w:before="160"/>
         <w:jc w:val="center"/>
       </w:pPr>
       <w:r>
-        <w:rPr>
-          <w:rFonts w:ascii="Courier New" w:cs="Courier New" w:eastAsia="Courier New" w:hAnsi="Courier New"/>
-          <w:i/>
-          <w:iCs/>
-          <w:color w:val="9A8F8A"/>
-          <w:sz w:val="20"/>
-          <w:szCs w:val="20"/>
-        </w:rPr>
-        <w:t xml:space="preserve">[ Screenshot: TC-09-01.png — Admin login page ]</w:t>
+        <w:drawing>
+          <wp:inline distT="0" distB="0" distL="0" distR="0">
+            <wp:extent cx="4572000" cy="2857500"/>
+            <wp:effectExtent t="0" r="0" b="0" l="0"/>
+            <wp:docPr id="1" name="" descr="" title=""/>
+            <wp:cNvGraphicFramePr>
+              <a:graphicFrameLocks xmlns:a="http://schemas.openxmlformats.org/drawingml/2006/main" noChangeAspect="1"/>
+            </wp:cNvGraphicFramePr>
+            <a:graphic xmlns:a="http://schemas.openxmlformats.org/drawingml/2006/main">
+              <a:graphicData uri="http://schemas.openxmlformats.org/drawingml/2006/picture">
+                <pic:pic xmlns:pic="http://schemas.openxmlformats.org/drawingml/2006/picture">
+                  <pic:nvPicPr>
+                    <pic:cNvPr id="0" name="" descr=""/>
+                    <pic:cNvPicPr>
+                      <a:picLocks noChangeAspect="1" noChangeArrowheads="1"/>
+                    </pic:cNvPicPr>
+                  </pic:nvPicPr>
+                  <pic:blipFill>
+                    <a:blip r:embed="rId16" cstate="none"/>
+                    <a:srcRect/>
+                    <a:stretch>
+                      <a:fillRect/>
+                    </a:stretch>
+                  </pic:blipFill>
+                  <pic:spPr bwMode="auto">
+                    <a:xfrm>
+                      <a:off x="0" y="0"/>
+                      <a:ext cx="4572000" cy="2857500"/>
+                    </a:xfrm>
+                    <a:prstGeom prst="rect">
+                      <a:avLst/>
+                    </a:prstGeom>
+                  </pic:spPr>
+                </pic:pic>
+              </a:graphicData>
+            </a:graphic>
+          </wp:inline>
+        </w:drawing>
       </w:r>
     </w:p>
     <w:p>
@@ -4221,26 +4441,48 @@
     </w:tbl>
     <w:p>
       <w:pPr>
-        <w:pBdr>
-          <w:top w:val="dashed" w:color="E8DDD9" w:sz="2"/>
-          <w:bottom w:val="dashed" w:color="E8DDD9" w:sz="2"/>
-          <w:left w:val="dashed" w:color="E8DDD9" w:sz="2"/>
-          <w:right w:val="dashed" w:color="E8DDD9" w:sz="2"/>
-        </w:pBdr>
-        <w:shd w:fill="FAFAFA" w:val="clear"/>
-        <w:spacing w:after="160" w:before="160"/>
+        <w:spacing w:after="80" w:before="160"/>
         <w:jc w:val="center"/>
       </w:pPr>
       <w:r>
-        <w:rPr>
-          <w:rFonts w:ascii="Courier New" w:cs="Courier New" w:eastAsia="Courier New" w:hAnsi="Courier New"/>
-          <w:i/>
-          <w:iCs/>
-          <w:color w:val="9A8F8A"/>
-          <w:sz w:val="20"/>
-          <w:szCs w:val="20"/>
-        </w:rPr>
-        <w:t xml:space="preserve">[ Screenshot: TC-09-04.png — Admin panel after successful login ]</w:t>
+        <w:drawing>
+          <wp:inline distT="0" distB="0" distL="0" distR="0">
+            <wp:extent cx="4572000" cy="2857500"/>
+            <wp:effectExtent t="0" r="0" b="0" l="0"/>
+            <wp:docPr id="1" name="" descr="" title=""/>
+            <wp:cNvGraphicFramePr>
+              <a:graphicFrameLocks xmlns:a="http://schemas.openxmlformats.org/drawingml/2006/main" noChangeAspect="1"/>
+            </wp:cNvGraphicFramePr>
+            <a:graphic xmlns:a="http://schemas.openxmlformats.org/drawingml/2006/main">
+              <a:graphicData uri="http://schemas.openxmlformats.org/drawingml/2006/picture">
+                <pic:pic xmlns:pic="http://schemas.openxmlformats.org/drawingml/2006/picture">
+                  <pic:nvPicPr>
+                    <pic:cNvPr id="0" name="" descr=""/>
+                    <pic:cNvPicPr>
+                      <a:picLocks noChangeAspect="1" noChangeArrowheads="1"/>
+                    </pic:cNvPicPr>
+                  </pic:nvPicPr>
+                  <pic:blipFill>
+                    <a:blip r:embed="rId17" cstate="none"/>
+                    <a:srcRect/>
+                    <a:stretch>
+                      <a:fillRect/>
+                    </a:stretch>
+                  </pic:blipFill>
+                  <pic:spPr bwMode="auto">
+                    <a:xfrm>
+                      <a:off x="0" y="0"/>
+                      <a:ext cx="4572000" cy="2857500"/>
+                    </a:xfrm>
+                    <a:prstGeom prst="rect">
+                      <a:avLst/>
+                    </a:prstGeom>
+                  </pic:spPr>
+                </pic:pic>
+              </a:graphicData>
+            </a:graphic>
+          </wp:inline>
+        </w:drawing>
       </w:r>
     </w:p>
     <w:p>
@@ -4517,26 +4759,48 @@
     </w:p>
     <w:p>
       <w:pPr>
-        <w:pBdr>
-          <w:top w:val="dashed" w:color="E8DDD9" w:sz="2"/>
-          <w:bottom w:val="dashed" w:color="E8DDD9" w:sz="2"/>
-          <w:left w:val="dashed" w:color="E8DDD9" w:sz="2"/>
-          <w:right w:val="dashed" w:color="E8DDD9" w:sz="2"/>
-        </w:pBdr>
-        <w:shd w:fill="FAFAFA" w:val="clear"/>
-        <w:spacing w:after="160" w:before="160"/>
+        <w:spacing w:after="80" w:before="160"/>
         <w:jc w:val="center"/>
       </w:pPr>
       <w:r>
-        <w:rPr>
-          <w:rFonts w:ascii="Courier New" w:cs="Courier New" w:eastAsia="Courier New" w:hAnsi="Courier New"/>
-          <w:i/>
-          <w:iCs/>
-          <w:color w:val="9A8F8A"/>
-          <w:sz w:val="20"/>
-          <w:szCs w:val="20"/>
-        </w:rPr>
-        <w:t xml:space="preserve">[ Screenshot: TC-10-01.png — Banner management list ]</w:t>
+        <w:drawing>
+          <wp:inline distT="0" distB="0" distL="0" distR="0">
+            <wp:extent cx="4572000" cy="2857500"/>
+            <wp:effectExtent t="0" r="0" b="0" l="0"/>
+            <wp:docPr id="1" name="" descr="" title=""/>
+            <wp:cNvGraphicFramePr>
+              <a:graphicFrameLocks xmlns:a="http://schemas.openxmlformats.org/drawingml/2006/main" noChangeAspect="1"/>
+            </wp:cNvGraphicFramePr>
+            <a:graphic xmlns:a="http://schemas.openxmlformats.org/drawingml/2006/main">
+              <a:graphicData uri="http://schemas.openxmlformats.org/drawingml/2006/picture">
+                <pic:pic xmlns:pic="http://schemas.openxmlformats.org/drawingml/2006/picture">
+                  <pic:nvPicPr>
+                    <pic:cNvPr id="0" name="" descr=""/>
+                    <pic:cNvPicPr>
+                      <a:picLocks noChangeAspect="1" noChangeArrowheads="1"/>
+                    </pic:cNvPicPr>
+                  </pic:nvPicPr>
+                  <pic:blipFill>
+                    <a:blip r:embed="rId17" cstate="none"/>
+                    <a:srcRect/>
+                    <a:stretch>
+                      <a:fillRect/>
+                    </a:stretch>
+                  </pic:blipFill>
+                  <pic:spPr bwMode="auto">
+                    <a:xfrm>
+                      <a:off x="0" y="0"/>
+                      <a:ext cx="4572000" cy="2857500"/>
+                    </a:xfrm>
+                    <a:prstGeom prst="rect">
+                      <a:avLst/>
+                    </a:prstGeom>
+                  </pic:spPr>
+                </pic:pic>
+              </a:graphicData>
+            </a:graphic>
+          </wp:inline>
+        </w:drawing>
       </w:r>
     </w:p>
     <w:p>
@@ -5754,26 +6018,48 @@
     </w:p>
     <w:p>
       <w:pPr>
-        <w:pBdr>
-          <w:top w:val="dashed" w:color="E8DDD9" w:sz="2"/>
-          <w:bottom w:val="dashed" w:color="E8DDD9" w:sz="2"/>
-          <w:left w:val="dashed" w:color="E8DDD9" w:sz="2"/>
-          <w:right w:val="dashed" w:color="E8DDD9" w:sz="2"/>
-        </w:pBdr>
-        <w:shd w:fill="FAFAFA" w:val="clear"/>
-        <w:spacing w:after="160" w:before="160"/>
+        <w:spacing w:after="80" w:before="160"/>
         <w:jc w:val="center"/>
       </w:pPr>
       <w:r>
-        <w:rPr>
-          <w:rFonts w:ascii="Courier New" w:cs="Courier New" w:eastAsia="Courier New" w:hAnsi="Courier New"/>
-          <w:i/>
-          <w:iCs/>
-          <w:color w:val="9A8F8A"/>
-          <w:sz w:val="20"/>
-          <w:szCs w:val="20"/>
-        </w:rPr>
-        <w:t xml:space="preserve">[ Screenshot: TC-11-01.png — Category management list ]</w:t>
+        <w:drawing>
+          <wp:inline distT="0" distB="0" distL="0" distR="0">
+            <wp:extent cx="4572000" cy="2857500"/>
+            <wp:effectExtent t="0" r="0" b="0" l="0"/>
+            <wp:docPr id="1" name="" descr="" title=""/>
+            <wp:cNvGraphicFramePr>
+              <a:graphicFrameLocks xmlns:a="http://schemas.openxmlformats.org/drawingml/2006/main" noChangeAspect="1"/>
+            </wp:cNvGraphicFramePr>
+            <a:graphic xmlns:a="http://schemas.openxmlformats.org/drawingml/2006/main">
+              <a:graphicData uri="http://schemas.openxmlformats.org/drawingml/2006/picture">
+                <pic:pic xmlns:pic="http://schemas.openxmlformats.org/drawingml/2006/picture">
+                  <pic:nvPicPr>
+                    <pic:cNvPr id="0" name="" descr=""/>
+                    <pic:cNvPicPr>
+                      <a:picLocks noChangeAspect="1" noChangeArrowheads="1"/>
+                    </pic:cNvPicPr>
+                  </pic:nvPicPr>
+                  <pic:blipFill>
+                    <a:blip r:embed="rId18" cstate="none"/>
+                    <a:srcRect/>
+                    <a:stretch>
+                      <a:fillRect/>
+                    </a:stretch>
+                  </pic:blipFill>
+                  <pic:spPr bwMode="auto">
+                    <a:xfrm>
+                      <a:off x="0" y="0"/>
+                      <a:ext cx="4572000" cy="2857500"/>
+                    </a:xfrm>
+                    <a:prstGeom prst="rect">
+                      <a:avLst/>
+                    </a:prstGeom>
+                  </pic:spPr>
+                </pic:pic>
+              </a:graphicData>
+            </a:graphic>
+          </wp:inline>
+        </w:drawing>
       </w:r>
     </w:p>
     <w:p>
@@ -6274,26 +6560,48 @@
     </w:p>
     <w:p>
       <w:pPr>
-        <w:pBdr>
-          <w:top w:val="dashed" w:color="E8DDD9" w:sz="2"/>
-          <w:bottom w:val="dashed" w:color="E8DDD9" w:sz="2"/>
-          <w:left w:val="dashed" w:color="E8DDD9" w:sz="2"/>
-          <w:right w:val="dashed" w:color="E8DDD9" w:sz="2"/>
-        </w:pBdr>
-        <w:shd w:fill="FAFAFA" w:val="clear"/>
-        <w:spacing w:after="160" w:before="160"/>
+        <w:spacing w:after="80" w:before="160"/>
         <w:jc w:val="center"/>
       </w:pPr>
       <w:r>
-        <w:rPr>
-          <w:rFonts w:ascii="Courier New" w:cs="Courier New" w:eastAsia="Courier New" w:hAnsi="Courier New"/>
-          <w:i/>
-          <w:iCs/>
-          <w:color w:val="9A8F8A"/>
-          <w:sz w:val="20"/>
-          <w:szCs w:val="20"/>
-        </w:rPr>
-        <w:t xml:space="preserve">[ Screenshot: TC-12-01.png — Product management list ]</w:t>
+        <w:drawing>
+          <wp:inline distT="0" distB="0" distL="0" distR="0">
+            <wp:extent cx="4572000" cy="2857500"/>
+            <wp:effectExtent t="0" r="0" b="0" l="0"/>
+            <wp:docPr id="1" name="" descr="" title=""/>
+            <wp:cNvGraphicFramePr>
+              <a:graphicFrameLocks xmlns:a="http://schemas.openxmlformats.org/drawingml/2006/main" noChangeAspect="1"/>
+            </wp:cNvGraphicFramePr>
+            <a:graphic xmlns:a="http://schemas.openxmlformats.org/drawingml/2006/main">
+              <a:graphicData uri="http://schemas.openxmlformats.org/drawingml/2006/picture">
+                <pic:pic xmlns:pic="http://schemas.openxmlformats.org/drawingml/2006/picture">
+                  <pic:nvPicPr>
+                    <pic:cNvPr id="0" name="" descr=""/>
+                    <pic:cNvPicPr>
+                      <a:picLocks noChangeAspect="1" noChangeArrowheads="1"/>
+                    </pic:cNvPicPr>
+                  </pic:nvPicPr>
+                  <pic:blipFill>
+                    <a:blip r:embed="rId19" cstate="none"/>
+                    <a:srcRect/>
+                    <a:stretch>
+                      <a:fillRect/>
+                    </a:stretch>
+                  </pic:blipFill>
+                  <pic:spPr bwMode="auto">
+                    <a:xfrm>
+                      <a:off x="0" y="0"/>
+                      <a:ext cx="4572000" cy="2857500"/>
+                    </a:xfrm>
+                    <a:prstGeom prst="rect">
+                      <a:avLst/>
+                    </a:prstGeom>
+                  </pic:spPr>
+                </pic:pic>
+              </a:graphicData>
+            </a:graphic>
+          </wp:inline>
+        </w:drawing>
       </w:r>
     </w:p>
     <w:p>
@@ -7740,26 +8048,48 @@
     </w:p>
     <w:p>
       <w:pPr>
-        <w:pBdr>
-          <w:top w:val="dashed" w:color="E8DDD9" w:sz="2"/>
-          <w:bottom w:val="dashed" w:color="E8DDD9" w:sz="2"/>
-          <w:left w:val="dashed" w:color="E8DDD9" w:sz="2"/>
-          <w:right w:val="dashed" w:color="E8DDD9" w:sz="2"/>
-        </w:pBdr>
-        <w:shd w:fill="FAFAFA" w:val="clear"/>
-        <w:spacing w:after="160" w:before="160"/>
+        <w:spacing w:after="80" w:before="160"/>
         <w:jc w:val="center"/>
       </w:pPr>
       <w:r>
-        <w:rPr>
-          <w:rFonts w:ascii="Courier New" w:cs="Courier New" w:eastAsia="Courier New" w:hAnsi="Courier New"/>
-          <w:i/>
-          <w:iCs/>
-          <w:color w:val="9A8F8A"/>
-          <w:sz w:val="20"/>
-          <w:szCs w:val="20"/>
-        </w:rPr>
-        <w:t xml:space="preserve">[ Screenshot: TC-13-01.png — Contact submissions list ]</w:t>
+        <w:drawing>
+          <wp:inline distT="0" distB="0" distL="0" distR="0">
+            <wp:extent cx="4572000" cy="2857500"/>
+            <wp:effectExtent t="0" r="0" b="0" l="0"/>
+            <wp:docPr id="1" name="" descr="" title=""/>
+            <wp:cNvGraphicFramePr>
+              <a:graphicFrameLocks xmlns:a="http://schemas.openxmlformats.org/drawingml/2006/main" noChangeAspect="1"/>
+            </wp:cNvGraphicFramePr>
+            <a:graphic xmlns:a="http://schemas.openxmlformats.org/drawingml/2006/main">
+              <a:graphicData uri="http://schemas.openxmlformats.org/drawingml/2006/picture">
+                <pic:pic xmlns:pic="http://schemas.openxmlformats.org/drawingml/2006/picture">
+                  <pic:nvPicPr>
+                    <pic:cNvPr id="0" name="" descr=""/>
+                    <pic:cNvPicPr>
+                      <a:picLocks noChangeAspect="1" noChangeArrowheads="1"/>
+                    </pic:cNvPicPr>
+                  </pic:nvPicPr>
+                  <pic:blipFill>
+                    <a:blip r:embed="rId20" cstate="none"/>
+                    <a:srcRect/>
+                    <a:stretch>
+                      <a:fillRect/>
+                    </a:stretch>
+                  </pic:blipFill>
+                  <pic:spPr bwMode="auto">
+                    <a:xfrm>
+                      <a:off x="0" y="0"/>
+                      <a:ext cx="4572000" cy="2857500"/>
+                    </a:xfrm>
+                    <a:prstGeom prst="rect">
+                      <a:avLst/>
+                    </a:prstGeom>
+                  </pic:spPr>
+                </pic:pic>
+              </a:graphicData>
+            </a:graphic>
+          </wp:inline>
+        </w:drawing>
       </w:r>
     </w:p>
     <w:p>
@@ -8172,26 +8502,48 @@
     </w:p>
     <w:p>
       <w:pPr>
-        <w:pBdr>
-          <w:top w:val="dashed" w:color="E8DDD9" w:sz="2"/>
-          <w:bottom w:val="dashed" w:color="E8DDD9" w:sz="2"/>
-          <w:left w:val="dashed" w:color="E8DDD9" w:sz="2"/>
-          <w:right w:val="dashed" w:color="E8DDD9" w:sz="2"/>
-        </w:pBdr>
-        <w:shd w:fill="FAFAFA" w:val="clear"/>
-        <w:spacing w:after="160" w:before="160"/>
+        <w:spacing w:after="80" w:before="160"/>
         <w:jc w:val="center"/>
       </w:pPr>
       <w:r>
-        <w:rPr>
-          <w:rFonts w:ascii="Courier New" w:cs="Courier New" w:eastAsia="Courier New" w:hAnsi="Courier New"/>
-          <w:i/>
-          <w:iCs/>
-          <w:color w:val="9A8F8A"/>
-          <w:sz w:val="20"/>
-          <w:szCs w:val="20"/>
-        </w:rPr>
-        <w:t xml:space="preserve">[ Screenshot: TC-15-01.png — Site Settings page overview ]</w:t>
+        <w:drawing>
+          <wp:inline distT="0" distB="0" distL="0" distR="0">
+            <wp:extent cx="4572000" cy="2857500"/>
+            <wp:effectExtent t="0" r="0" b="0" l="0"/>
+            <wp:docPr id="1" name="" descr="" title=""/>
+            <wp:cNvGraphicFramePr>
+              <a:graphicFrameLocks xmlns:a="http://schemas.openxmlformats.org/drawingml/2006/main" noChangeAspect="1"/>
+            </wp:cNvGraphicFramePr>
+            <a:graphic xmlns:a="http://schemas.openxmlformats.org/drawingml/2006/main">
+              <a:graphicData uri="http://schemas.openxmlformats.org/drawingml/2006/picture">
+                <pic:pic xmlns:pic="http://schemas.openxmlformats.org/drawingml/2006/picture">
+                  <pic:nvPicPr>
+                    <pic:cNvPr id="0" name="" descr=""/>
+                    <pic:cNvPicPr>
+                      <a:picLocks noChangeAspect="1" noChangeArrowheads="1"/>
+                    </pic:cNvPicPr>
+                  </pic:nvPicPr>
+                  <pic:blipFill>
+                    <a:blip r:embed="rId21" cstate="none"/>
+                    <a:srcRect/>
+                    <a:stretch>
+                      <a:fillRect/>
+                    </a:stretch>
+                  </pic:blipFill>
+                  <pic:spPr bwMode="auto">
+                    <a:xfrm>
+                      <a:off x="0" y="0"/>
+                      <a:ext cx="4572000" cy="2857500"/>
+                    </a:xfrm>
+                    <a:prstGeom prst="rect">
+                      <a:avLst/>
+                    </a:prstGeom>
+                  </pic:spPr>
+                </pic:pic>
+              </a:graphicData>
+            </a:graphic>
+          </wp:inline>
+        </w:drawing>
       </w:r>
     </w:p>
     <w:p>

</xml_diff>